<commit_message>
update the names in template
</commit_message>
<xml_diff>
--- a/backend/templates/deans-list-template.docx
+++ b/backend/templates/deans-list-template.docx
@@ -568,20 +568,39 @@
     <w:p>
       <w:pPr>
         <w:spacing w:after="0"/>
+        <w:rPr>
+          <w:b/>
+          <w:bCs/>
+        </w:rPr>
       </w:pPr>
       <w:r>
         <w:rPr>
           <w:b/>
+          <w:bCs/>
         </w:rPr>
-        <w:t>MELANIE R. ALBARRACIN, Dev. Ed. D.</w:t>
+        <w:t xml:space="preserve">CHRISTINE JOY A TOMOL, </w:t>
       </w:r>
+      <w:proofErr w:type="spellStart"/>
+      <w:proofErr w:type="gramStart"/>
+      <w:r>
+        <w:rPr>
+          <w:b/>
+          <w:bCs/>
+        </w:rPr>
+        <w:t>Ph.D</w:t>
+      </w:r>
+      <w:proofErr w:type="spellEnd"/>
+      <w:proofErr w:type="gramEnd"/>
     </w:p>
     <w:p>
       <w:pPr>
         <w:spacing w:after="480"/>
       </w:pPr>
       <w:r>
-        <w:t>OIC, BSIT Department</w:t>
+        <w:t>Chairperson</w:t>
+      </w:r>
+      <w:r>
+        <w:t>, BSIT Department</w:t>
       </w:r>
     </w:p>
     <w:p>
@@ -595,13 +614,29 @@
     <w:p>
       <w:pPr>
         <w:spacing w:after="0"/>
+        <w:rPr>
+          <w:b/>
+          <w:bCs/>
+        </w:rPr>
       </w:pPr>
       <w:r>
         <w:rPr>
           <w:b/>
+          <w:bCs/>
         </w:rPr>
-        <w:t>HELMER M. BAÑADOS, Ph.D.</w:t>
+        <w:t xml:space="preserve">FRITZ D. BACALSO, </w:t>
       </w:r>
+      <w:proofErr w:type="spellStart"/>
+      <w:proofErr w:type="gramStart"/>
+      <w:r>
+        <w:rPr>
+          <w:b/>
+          <w:bCs/>
+        </w:rPr>
+        <w:t>Ph.D</w:t>
+      </w:r>
+      <w:proofErr w:type="spellEnd"/>
+      <w:proofErr w:type="gramEnd"/>
     </w:p>
     <w:p>
       <w:pPr>
@@ -1612,7 +1647,6 @@
   <w:style w:type="character" w:default="1" w:styleId="DefaultParagraphFont">
     <w:name w:val="Default Paragraph Font"/>
     <w:uiPriority w:val="1"/>
-    <w:semiHidden/>
     <w:unhideWhenUsed/>
   </w:style>
   <w:style w:type="table" w:default="1" w:styleId="TableNormal">

</xml_diff>

<commit_message>
update dean's list and add latin honor
</commit_message>
<xml_diff>
--- a/backend/templates/deans-list-template.docx
+++ b/backend/templates/deans-list-template.docx
@@ -7,7 +7,7 @@
         <w:spacing w:after="360"/>
       </w:pPr>
       <w:r>
-        <w:t>{date}</w:t>
+        <w:t xml:space="preserve">{date}</w:t>
       </w:r>
     </w:p>
     <w:p>
@@ -17,8 +17,9 @@
       <w:r>
         <w:rPr>
           <w:b/>
+          <w:bCs/>
         </w:rPr>
-        <w:t>EINGILBERT C. BENOLIRAO, Dev.Ed.D.</w:t>
+        <w:t xml:space="preserve">EINGILBERT C. BENOLIRAO, Dev.Ed.D.</w:t>
       </w:r>
     </w:p>
     <w:p>
@@ -26,7 +27,7 @@
         <w:spacing w:after="0"/>
       </w:pPr>
       <w:r>
-        <w:t>Campus Director</w:t>
+        <w:t xml:space="preserve">Campus Director</w:t>
       </w:r>
     </w:p>
     <w:p>
@@ -34,7 +35,428 @@
         <w:spacing w:after="360"/>
       </w:pPr>
       <w:r>
-        <w:t>This University</w:t>
+        <w:t xml:space="preserve">This University</w:t>
+      </w:r>
+    </w:p>
+    <w:p>
+      <w:pPr>
+        <w:spacing w:after="240"/>
+      </w:pPr>
+      <w:r>
+        <w:rPr>
+          <w:b/>
+          <w:bCs/>
+        </w:rPr>
+        <w:t xml:space="preserve">Sir:</w:t>
+      </w:r>
+    </w:p>
+    <w:p>
+      <w:pPr>
+        <w:spacing w:after="240"/>
+        <w:ind w:firstLine="720"/>
+        <w:jc w:val="both"/>
+      </w:pPr>
+      <w:r>
+        <w:t xml:space="preserve">Submitting herewith is the Official list of </w:t>
+      </w:r>
+      <w:r>
+        <w:rPr>
+          <w:b/>
+          <w:bCs/>
+        </w:rPr>
+        <w:t xml:space="preserve">Academic Champions</w:t>
+      </w:r>
+      <w:r>
+        <w:t xml:space="preserve"> of the </w:t>
+      </w:r>
+      <w:r>
+        <w:rPr>
+          <w:b/>
+          <w:bCs/>
+          <w:u w:val="single"/>
+        </w:rPr>
+        <w:t xml:space="preserve">Bachelor of Science in Information Technology</w:t>
+      </w:r>
+      <w:r>
+        <w:t xml:space="preserve"> based on </w:t>
+      </w:r>
+      <w:r>
+        <w:rPr>
+          <w:b/>
+          <w:bCs/>
+          <w:u w:val="single"/>
+        </w:rPr>
+        <w:t xml:space="preserve">{semester}</w:t>
+      </w:r>
+      <w:r>
+        <w:t xml:space="preserve">, AY </w:t>
+      </w:r>
+      <w:r>
+        <w:rPr>
+          <w:b/>
+          <w:bCs/>
+          <w:u w:val="single"/>
+        </w:rPr>
+        <w:t xml:space="preserve">{ay}</w:t>
+      </w:r>
+      <w:r>
+        <w:t xml:space="preserve"> ratings as specified below:</w:t>
+      </w:r>
+    </w:p>
+    <w:tbl>
+      <w:tblPr>
+        <w:tblStyle w:val="TableGrid"/>
+        <w:tblW w:w="9360" w:type="dxa"/>
+        <w:jc w:val="center"/>
+        <w:tblLayout w:type="fixed"/>
+        <w:tblLook w:val="04A0" w:firstRow="1" w:lastRow="0" w:firstColumn="1" w:lastColumn="0" w:noHBand="0" w:noVBand="1"/>
+      </w:tblPr>
+      <w:tblGrid>
+        <w:gridCol w:w="1620"/>
+        <w:gridCol w:w="3240"/>
+        <w:gridCol w:w="1620"/>
+        <w:gridCol w:w="1620"/>
+        <w:gridCol w:w="1260"/>
+      </w:tblGrid>
+      <w:tr>
+        <w:trPr>
+          <w:cantSplit/>
+          <w:tblHeader/>
+        </w:trPr>
+        <w:tc>
+          <w:tcPr>
+            <w:tcW w:w="1620" w:type="dxa"/>
+            <w:shd w:val="clear" w:color="auto" w:fill="EAF1DD"/>
+            <w:vAlign w:val="center"/>
+          </w:tcPr>
+          <w:p>
+            <w:pPr>
+              <w:spacing w:after="0"/>
+              <w:jc w:val="center"/>
+            </w:pPr>
+            <w:r>
+              <w:rPr>
+                <w:b/>
+                <w:bCs/>
+              </w:rPr>
+              <w:t xml:space="preserve">Program/ Year/Section</w:t>
+            </w:r>
+          </w:p>
+        </w:tc>
+        <w:tc>
+          <w:tcPr>
+            <w:tcW w:w="3240" w:type="dxa"/>
+            <w:shd w:val="clear" w:color="auto" w:fill="EAF1DD"/>
+            <w:vAlign w:val="center"/>
+          </w:tcPr>
+          <w:p>
+            <w:pPr>
+              <w:spacing w:after="0"/>
+              <w:jc w:val="center"/>
+            </w:pPr>
+            <w:r>
+              <w:rPr>
+                <w:b/>
+                <w:bCs/>
+              </w:rPr>
+              <w:t xml:space="preserve">Class Adviser</w:t>
+            </w:r>
+          </w:p>
+        </w:tc>
+        <w:tc>
+          <w:tcPr>
+            <w:tcW w:w="1620" w:type="dxa"/>
+            <w:shd w:val="clear" w:color="auto" w:fill="EAF1DD"/>
+            <w:vAlign w:val="center"/>
+          </w:tcPr>
+          <w:p>
+            <w:pPr>
+              <w:spacing w:after="0"/>
+              <w:jc w:val="center"/>
+            </w:pPr>
+            <w:r>
+              <w:rPr>
+                <w:b/>
+                <w:bCs/>
+              </w:rPr>
+              <w:t xml:space="preserve">Total No. of Students</w:t>
+            </w:r>
+          </w:p>
+        </w:tc>
+        <w:tc>
+          <w:tcPr>
+            <w:tcW w:w="1620" w:type="dxa"/>
+            <w:shd w:val="clear" w:color="auto" w:fill="EAF1DD"/>
+            <w:vAlign w:val="center"/>
+          </w:tcPr>
+          <w:p>
+            <w:pPr>
+              <w:spacing w:after="0"/>
+              <w:jc w:val="center"/>
+            </w:pPr>
+            <w:r>
+              <w:rPr>
+                <w:b/>
+                <w:bCs/>
+              </w:rPr>
+              <w:t xml:space="preserve">No. of Academic Champions</w:t>
+            </w:r>
+          </w:p>
+        </w:tc>
+        <w:tc>
+          <w:tcPr>
+            <w:tcW w:w="1260" w:type="dxa"/>
+            <w:shd w:val="clear" w:color="auto" w:fill="C4D79B"/>
+            <w:vAlign w:val="center"/>
+          </w:tcPr>
+          <w:p>
+            <w:pPr>
+              <w:spacing w:after="0"/>
+              <w:jc w:val="center"/>
+            </w:pPr>
+            <w:r>
+              <w:rPr>
+                <w:b/>
+                <w:bCs/>
+              </w:rPr>
+              <w:t xml:space="preserve">%</w:t>
+            </w:r>
+          </w:p>
+        </w:tc>
+      </w:tr>
+      <w:tr>
+        <w:trPr>
+          <w:cantSplit/>
+        </w:trPr>
+        <w:tc>
+          <w:tcPr>
+            <w:tcW w:w="1620" w:type="dxa"/>
+            <w:vAlign w:val="center"/>
+          </w:tcPr>
+          <w:p>
+            <w:pPr>
+              <w:spacing w:after="0"/>
+              <w:jc w:val="center"/>
+            </w:pPr>
+            <w:r>
+              <w:t xml:space="preserve">{#summaryRows}{program}</w:t>
+            </w:r>
+          </w:p>
+        </w:tc>
+        <w:tc>
+          <w:tcPr>
+            <w:tcW w:w="3240" w:type="dxa"/>
+            <w:vAlign w:val="center"/>
+          </w:tcPr>
+          <w:p>
+            <w:pPr>
+              <w:spacing w:after="0"/>
+              <w:jc w:val="left"/>
+            </w:pPr>
+            <w:r>
+              <w:t xml:space="preserve">{adviser}</w:t>
+            </w:r>
+          </w:p>
+        </w:tc>
+        <w:tc>
+          <w:tcPr>
+            <w:tcW w:w="1620" w:type="dxa"/>
+            <w:vAlign w:val="center"/>
+          </w:tcPr>
+          <w:p>
+            <w:pPr>
+              <w:spacing w:after="0"/>
+              <w:jc w:val="center"/>
+            </w:pPr>
+            <w:r>
+              <w:t xml:space="preserve">{totalStudents}</w:t>
+            </w:r>
+          </w:p>
+        </w:tc>
+        <w:tc>
+          <w:tcPr>
+            <w:tcW w:w="1620" w:type="dxa"/>
+            <w:vAlign w:val="center"/>
+          </w:tcPr>
+          <w:p>
+            <w:pPr>
+              <w:spacing w:after="0"/>
+              <w:jc w:val="center"/>
+            </w:pPr>
+            <w:r>
+              <w:t xml:space="preserve">{champions}</w:t>
+            </w:r>
+          </w:p>
+        </w:tc>
+        <w:tc>
+          <w:tcPr>
+            <w:tcW w:w="1260" w:type="dxa"/>
+            <w:shd w:val="clear" w:color="auto" w:fill="C4D79B"/>
+            <w:vAlign w:val="center"/>
+          </w:tcPr>
+          <w:p>
+            <w:pPr>
+              <w:spacing w:after="0"/>
+              <w:jc w:val="center"/>
+            </w:pPr>
+            <w:r>
+              <w:rPr>
+                <w:i/>
+                <w:iCs/>
+              </w:rPr>
+              <w:t xml:space="preserve">{percent}{/summaryRows}</w:t>
+            </w:r>
+          </w:p>
+        </w:tc>
+      </w:tr>
+      <w:tr>
+        <w:trPr>
+          <w:cantSplit/>
+        </w:trPr>
+        <w:tc>
+          <w:tcPr>
+            <w:tcW w:w="1620" w:type="dxa"/>
+            <w:shd w:val="clear" w:color="auto" w:fill="FFFFFF"/>
+            <w:vAlign w:val="center"/>
+          </w:tcPr>
+          <w:p>
+            <w:pPr>
+              <w:spacing w:after="0"/>
+              <w:jc w:val="center"/>
+            </w:pPr>
+          </w:p>
+        </w:tc>
+        <w:tc>
+          <w:tcPr>
+            <w:tcW w:w="3240" w:type="dxa"/>
+            <w:shd w:val="clear" w:color="auto" w:fill="FFFFFF"/>
+            <w:vAlign w:val="center"/>
+          </w:tcPr>
+          <w:p>
+            <w:pPr>
+              <w:spacing w:after="0"/>
+              <w:jc w:val="center"/>
+            </w:pPr>
+          </w:p>
+        </w:tc>
+        <w:tc>
+          <w:tcPr>
+            <w:tcW w:w="1620" w:type="dxa"/>
+            <w:shd w:val="clear" w:color="auto" w:fill="76923C"/>
+            <w:vAlign w:val="center"/>
+          </w:tcPr>
+          <w:p>
+            <w:pPr>
+              <w:spacing w:after="0"/>
+              <w:jc w:val="center"/>
+            </w:pPr>
+            <w:r>
+              <w:rPr>
+                <w:b/>
+                <w:bCs/>
+              </w:rPr>
+              <w:t xml:space="preserve">{grandTotalStudents}</w:t>
+            </w:r>
+          </w:p>
+        </w:tc>
+        <w:tc>
+          <w:tcPr>
+            <w:tcW w:w="1620" w:type="dxa"/>
+            <w:shd w:val="clear" w:color="auto" w:fill="76923C"/>
+            <w:vAlign w:val="center"/>
+          </w:tcPr>
+          <w:p>
+            <w:pPr>
+              <w:spacing w:after="0"/>
+              <w:jc w:val="center"/>
+            </w:pPr>
+            <w:r>
+              <w:rPr>
+                <w:b/>
+                <w:bCs/>
+              </w:rPr>
+              <w:t xml:space="preserve">{grandTotalChampions}</w:t>
+            </w:r>
+          </w:p>
+        </w:tc>
+        <w:tc>
+          <w:tcPr>
+            <w:tcW w:w="1260" w:type="dxa"/>
+            <w:shd w:val="clear" w:color="auto" w:fill="76923C"/>
+            <w:vAlign w:val="center"/>
+          </w:tcPr>
+          <w:p>
+            <w:pPr>
+              <w:spacing w:after="0"/>
+              <w:jc w:val="center"/>
+            </w:pPr>
+            <w:r>
+              <w:rPr>
+                <w:b/>
+                <w:bCs/>
+              </w:rPr>
+              <w:t xml:space="preserve">{grandPercent}</w:t>
+            </w:r>
+          </w:p>
+        </w:tc>
+      </w:tr>
+    </w:tbl>
+    <w:p>
+      <w:pPr>
+        <w:spacing w:after="120"/>
+      </w:pPr>
+    </w:p>
+    <w:p>
+      <w:pPr>
+        <w:spacing w:after="240"/>
+        <w:ind w:firstLine="720"/>
+        <w:jc w:val="both"/>
+      </w:pPr>
+      <w:r>
+        <w:t xml:space="preserve">These top performing students will be recognized on </w:t>
+      </w:r>
+      <w:r>
+        <w:rPr>
+          <w:b/>
+          <w:bCs/>
+          <w:u w:val="single"/>
+        </w:rPr>
+        <w:t xml:space="preserve">{recognitionDate}</w:t>
+      </w:r>
+      <w:r>
+        <w:t xml:space="preserve"> during the </w:t>
+      </w:r>
+      <w:r>
+        <w:rPr>
+          <w:b/>
+          <w:bCs/>
+        </w:rPr>
+        <w:t xml:space="preserve">{semester}</w:t>
+      </w:r>
+      <w:r>
+        <w:t xml:space="preserve">, AY </w:t>
+      </w:r>
+      <w:r>
+        <w:rPr>
+          <w:b/>
+          <w:bCs/>
+        </w:rPr>
+        <w:t xml:space="preserve">{ay}</w:t>
+      </w:r>
+      <w:r>
+        <w:t xml:space="preserve"> Recognition Program dubbed as Champions’ Trail in the University: Academic Convocation with the theme, </w:t>
+      </w:r>
+      <w:r>
+        <w:rPr>
+          <w:b/>
+          <w:bCs/>
+          <w:i/>
+          <w:iCs/>
+        </w:rPr>
+        <w:t xml:space="preserve">“{theme}”</w:t>
+      </w:r>
+      <w:r>
+        <w:t xml:space="preserve"> and this will be attended by the faculty members and academic champions.</w:t>
       </w:r>
     </w:p>
     <w:p>
@@ -42,7 +464,539 @@
         <w:spacing w:after="0"/>
       </w:pPr>
       <w:r>
-        <w:t>THRU:</w:t>
+        <w:t xml:space="preserve">{#highestGwaGroups}</w:t>
+      </w:r>
+    </w:p>
+    <w:p>
+      <w:pPr>
+        <w:keepNext/>
+        <w:spacing w:after="120"/>
+        <w:ind w:firstLine="720"/>
+        <w:jc w:val="both"/>
+      </w:pPr>
+      <w:r>
+        <w:t xml:space="preserve">Furthermore, the college identified TOP 1 PERFORMING STUDENT per program as specified below:</w:t>
+      </w:r>
+    </w:p>
+    <w:p>
+      <w:pPr>
+        <w:keepNext/>
+        <w:tabs>
+          <w:tab w:val="left" w:pos="1800"/>
+        </w:tabs>
+        <w:spacing w:after="120"/>
+      </w:pPr>
+      <w:r>
+        <w:t xml:space="preserve">Recognition</w:t>
+      </w:r>
+      <w:r>
+        <w:tab/>
+      </w:r>
+      <w:r>
+        <w:t xml:space="preserve">: </w:t>
+      </w:r>
+      <w:r>
+        <w:rPr>
+          <w:b/>
+          <w:bCs/>
+          <w:u w:val="single"/>
+        </w:rPr>
+        <w:t xml:space="preserve">Highest GWA – All Year Levels</w:t>
+      </w:r>
+    </w:p>
+    <w:tbl>
+      <w:tblPr>
+        <w:tblStyle w:val="TableGrid"/>
+        <w:tblW w:w="9360" w:type="dxa"/>
+        <w:jc w:val="center"/>
+        <w:tblLayout w:type="fixed"/>
+        <w:tblLook w:val="04A0" w:firstRow="1" w:lastRow="0" w:firstColumn="1" w:lastColumn="0" w:noHBand="0" w:noVBand="1"/>
+      </w:tblPr>
+      <w:tblGrid>
+        <w:gridCol w:w="1300"/>
+        <w:gridCol w:w="2700"/>
+        <w:gridCol w:w="1600"/>
+        <w:gridCol w:w="1000"/>
+        <w:gridCol w:w="2760"/>
+      </w:tblGrid>
+      <w:tr>
+        <w:trPr>
+          <w:cantSplit/>
+          <w:tblHeader/>
+        </w:trPr>
+        <w:tc>
+          <w:tcPr>
+            <w:tcW w:w="1300" w:type="dxa"/>
+            <w:shd w:val="clear" w:color="auto" w:fill="EAF1DD"/>
+            <w:vAlign w:val="center"/>
+          </w:tcPr>
+          <w:p>
+            <w:pPr>
+              <w:spacing w:after="0"/>
+              <w:jc w:val="center"/>
+            </w:pPr>
+            <w:r>
+              <w:rPr>
+                <w:b/>
+                <w:bCs/>
+              </w:rPr>
+              <w:t xml:space="preserve">Program</w:t>
+            </w:r>
+          </w:p>
+        </w:tc>
+        <w:tc>
+          <w:tcPr>
+            <w:tcW w:w="2700" w:type="dxa"/>
+            <w:shd w:val="clear" w:color="auto" w:fill="EAF1DD"/>
+            <w:vAlign w:val="center"/>
+          </w:tcPr>
+          <w:p>
+            <w:pPr>
+              <w:spacing w:after="0"/>
+              <w:jc w:val="center"/>
+            </w:pPr>
+            <w:r>
+              <w:rPr>
+                <w:b/>
+                <w:bCs/>
+              </w:rPr>
+              <w:t xml:space="preserve">Name of Student</w:t>
+            </w:r>
+          </w:p>
+        </w:tc>
+        <w:tc>
+          <w:tcPr>
+            <w:tcW w:w="1600" w:type="dxa"/>
+            <w:shd w:val="clear" w:color="auto" w:fill="EAF1DD"/>
+            <w:vAlign w:val="center"/>
+          </w:tcPr>
+          <w:p>
+            <w:pPr>
+              <w:spacing w:after="0"/>
+              <w:jc w:val="center"/>
+            </w:pPr>
+            <w:r>
+              <w:rPr>
+                <w:b/>
+                <w:bCs/>
+              </w:rPr>
+              <w:t xml:space="preserve">Year Level/ Section</w:t>
+            </w:r>
+          </w:p>
+        </w:tc>
+        <w:tc>
+          <w:tcPr>
+            <w:tcW w:w="1000" w:type="dxa"/>
+            <w:shd w:val="clear" w:color="auto" w:fill="EAF1DD"/>
+            <w:vAlign w:val="center"/>
+          </w:tcPr>
+          <w:p>
+            <w:pPr>
+              <w:spacing w:after="0"/>
+              <w:jc w:val="center"/>
+            </w:pPr>
+            <w:r>
+              <w:rPr>
+                <w:b/>
+                <w:bCs/>
+              </w:rPr>
+              <w:t xml:space="preserve">GPA</w:t>
+            </w:r>
+          </w:p>
+        </w:tc>
+        <w:tc>
+          <w:tcPr>
+            <w:tcW w:w="2760" w:type="dxa"/>
+            <w:shd w:val="clear" w:color="auto" w:fill="EAF1DD"/>
+            <w:vAlign w:val="center"/>
+          </w:tcPr>
+          <w:p>
+            <w:pPr>
+              <w:spacing w:after="0"/>
+              <w:jc w:val="center"/>
+            </w:pPr>
+            <w:r>
+              <w:rPr>
+                <w:b/>
+                <w:bCs/>
+              </w:rPr>
+              <w:t xml:space="preserve">What to receive</w:t>
+            </w:r>
+          </w:p>
+        </w:tc>
+      </w:tr>
+      <w:tr>
+        <w:trPr>
+          <w:cantSplit/>
+        </w:trPr>
+        <w:tc>
+          <w:tcPr>
+            <w:tcW w:w="1300" w:type="dxa"/>
+            <w:vAlign w:val="center"/>
+          </w:tcPr>
+          <w:p>
+            <w:pPr>
+              <w:spacing w:after="0"/>
+              <w:jc w:val="center"/>
+            </w:pPr>
+            <w:r>
+              <w:rPr>
+                <w:b/>
+                <w:bCs/>
+              </w:rPr>
+              <w:t xml:space="preserve">{#highestStudents}BSIT</w:t>
+            </w:r>
+          </w:p>
+        </w:tc>
+        <w:tc>
+          <w:tcPr>
+            <w:tcW w:w="2700" w:type="dxa"/>
+            <w:vAlign w:val="center"/>
+          </w:tcPr>
+          <w:p>
+            <w:pPr>
+              <w:spacing w:after="0"/>
+              <w:jc w:val="center"/>
+            </w:pPr>
+            <w:r>
+              <w:rPr>
+                <w:b/>
+                <w:bCs/>
+              </w:rPr>
+              <w:t xml:space="preserve">{name}</w:t>
+            </w:r>
+          </w:p>
+        </w:tc>
+        <w:tc>
+          <w:tcPr>
+            <w:tcW w:w="1600" w:type="dxa"/>
+            <w:vAlign w:val="center"/>
+          </w:tcPr>
+          <w:p>
+            <w:pPr>
+              <w:spacing w:after="0"/>
+              <w:jc w:val="center"/>
+            </w:pPr>
+            <w:r>
+              <w:rPr>
+                <w:b/>
+                <w:bCs/>
+              </w:rPr>
+              <w:t xml:space="preserve">{yearSection}</w:t>
+            </w:r>
+          </w:p>
+        </w:tc>
+        <w:tc>
+          <w:tcPr>
+            <w:tcW w:w="1000" w:type="dxa"/>
+            <w:vAlign w:val="center"/>
+          </w:tcPr>
+          <w:p>
+            <w:pPr>
+              <w:spacing w:after="0"/>
+              <w:jc w:val="center"/>
+            </w:pPr>
+            <w:r>
+              <w:rPr>
+                <w:b/>
+                <w:bCs/>
+              </w:rPr>
+              <w:t xml:space="preserve">{gwa}</w:t>
+            </w:r>
+          </w:p>
+        </w:tc>
+        <w:tc>
+          <w:tcPr>
+            <w:tcW w:w="2760" w:type="dxa"/>
+            <w:vAlign w:val="center"/>
+          </w:tcPr>
+          <w:p>
+            <w:pPr>
+              <w:spacing w:after="0"/>
+              <w:jc w:val="center"/>
+            </w:pPr>
+            <w:r>
+              <w:t xml:space="preserve">Medal and Cash Incentive{/highestStudents}</w:t>
+            </w:r>
+          </w:p>
+        </w:tc>
+      </w:tr>
+    </w:tbl>
+    <w:p>
+      <w:pPr>
+        <w:spacing w:after="120"/>
+      </w:pPr>
+    </w:p>
+    <w:p>
+      <w:pPr>
+        <w:spacing w:after="0"/>
+      </w:pPr>
+      <w:r>
+        <w:t xml:space="preserve">{/highestGwaGroups}</w:t>
+      </w:r>
+    </w:p>
+    <w:p>
+      <w:pPr>
+        <w:spacing w:after="360"/>
+        <w:ind w:firstLine="720"/>
+        <w:jc w:val="both"/>
+      </w:pPr>
+      <w:r>
+        <w:t xml:space="preserve">Attached herewith is the list of top performing students by section/class. May you find this correct and in order. Thank you and God bless.</w:t>
+      </w:r>
+    </w:p>
+    <w:tbl>
+      <w:tblPr>
+        <w:tblStyle w:val="TableGrid"/>
+        <w:tblW w:w="9360" w:type="dxa"/>
+        <w:jc w:val="left"/>
+        <w:tblBorders>
+          <w:top w:val="nil"/>
+          <w:left w:val="nil"/>
+          <w:bottom w:val="nil"/>
+          <w:right w:val="nil"/>
+          <w:insideH w:val="nil"/>
+          <w:insideV w:val="nil"/>
+        </w:tblBorders>
+        <w:tblLayout w:type="fixed"/>
+        <w:tblLook w:val="04A0" w:firstRow="1" w:lastRow="0" w:firstColumn="1" w:lastColumn="0" w:noHBand="0" w:noVBand="1"/>
+      </w:tblPr>
+      <w:tblGrid>
+        <w:gridCol w:w="4680"/>
+        <w:gridCol w:w="4680"/>
+      </w:tblGrid>
+      <w:tr>
+        <w:trPr>
+          <w:cantSplit/>
+        </w:trPr>
+        <w:tc>
+          <w:tcPr>
+            <w:tcW w:w="4680" w:type="dxa"/>
+            <w:vAlign w:val="center"/>
+          </w:tcPr>
+          <w:p>
+            <w:pPr>
+              <w:spacing w:after="0"/>
+              <w:jc w:val="left"/>
+            </w:pPr>
+            <w:r>
+              <w:t xml:space="preserve">Very truly yours,</w:t>
+            </w:r>
+          </w:p>
+        </w:tc>
+        <w:tc>
+          <w:tcPr>
+            <w:tcW w:w="4680" w:type="dxa"/>
+            <w:vAlign w:val="center"/>
+          </w:tcPr>
+          <w:p>
+            <w:pPr>
+              <w:spacing w:after="0"/>
+              <w:jc w:val="left"/>
+            </w:pPr>
+            <w:r>
+              <w:rPr>
+                <w:b/>
+                <w:bCs/>
+                <w:i/>
+                <w:iCs/>
+              </w:rPr>
+              <w:t xml:space="preserve">Reviewed by:</w:t>
+            </w:r>
+          </w:p>
+        </w:tc>
+      </w:tr>
+      <w:tr>
+        <w:trPr>
+          <w:cantSplit/>
+        </w:trPr>
+        <w:tc>
+          <w:tcPr>
+            <w:tcW w:w="4680" w:type="dxa"/>
+            <w:vAlign w:val="center"/>
+          </w:tcPr>
+          <w:p>
+            <w:pPr>
+              <w:spacing w:after="480"/>
+              <w:jc w:val="left"/>
+            </w:pPr>
+          </w:p>
+        </w:tc>
+        <w:tc>
+          <w:tcPr>
+            <w:tcW w:w="4680" w:type="dxa"/>
+            <w:vAlign w:val="center"/>
+          </w:tcPr>
+          <w:p>
+            <w:pPr>
+              <w:spacing w:after="480"/>
+              <w:jc w:val="left"/>
+            </w:pPr>
+          </w:p>
+        </w:tc>
+      </w:tr>
+      <w:tr>
+        <w:trPr>
+          <w:cantSplit/>
+        </w:trPr>
+        <w:tc>
+          <w:tcPr>
+            <w:tcW w:w="4680" w:type="dxa"/>
+            <w:vAlign w:val="center"/>
+          </w:tcPr>
+          <w:p>
+            <w:pPr>
+              <w:spacing w:after="0"/>
+              <w:jc w:val="left"/>
+            </w:pPr>
+            <w:r>
+              <w:rPr>
+                <w:b/>
+                <w:bCs/>
+                <w:u w:val="single"/>
+              </w:rPr>
+              <w:t xml:space="preserve">CHRISTINE JOY A. TOMOL, Ph. D.</w:t>
+            </w:r>
+          </w:p>
+        </w:tc>
+        <w:tc>
+          <w:tcPr>
+            <w:tcW w:w="4680" w:type="dxa"/>
+            <w:vAlign w:val="center"/>
+          </w:tcPr>
+          <w:p>
+            <w:pPr>
+              <w:spacing w:after="0"/>
+              <w:jc w:val="center"/>
+            </w:pPr>
+            <w:r>
+              <w:rPr>
+                <w:b/>
+                <w:bCs/>
+                <w:u w:val="single"/>
+              </w:rPr>
+              <w:t xml:space="preserve">FRITZ D. BACALSO, MSME</w:t>
+            </w:r>
+          </w:p>
+        </w:tc>
+      </w:tr>
+      <w:tr>
+        <w:trPr>
+          <w:cantSplit/>
+        </w:trPr>
+        <w:tc>
+          <w:tcPr>
+            <w:tcW w:w="4680" w:type="dxa"/>
+            <w:vAlign w:val="center"/>
+          </w:tcPr>
+          <w:p>
+            <w:pPr>
+              <w:spacing w:after="0"/>
+              <w:jc w:val="left"/>
+            </w:pPr>
+            <w:r>
+              <w:t xml:space="preserve">Chairperson, BSIT</w:t>
+            </w:r>
+          </w:p>
+        </w:tc>
+        <w:tc>
+          <w:tcPr>
+            <w:tcW w:w="4680" w:type="dxa"/>
+            <w:vAlign w:val="center"/>
+          </w:tcPr>
+          <w:p>
+            <w:pPr>
+              <w:spacing w:after="0"/>
+              <w:jc w:val="center"/>
+            </w:pPr>
+            <w:r>
+              <w:t xml:space="preserve">Dean, COTE</w:t>
+            </w:r>
+          </w:p>
+        </w:tc>
+      </w:tr>
+    </w:tbl>
+    <w:p>
+      <w:pPr>
+        <w:spacing w:after="240"/>
+      </w:pPr>
+    </w:p>
+    <w:p>
+      <w:pPr>
+        <w:keepNext/>
+        <w:spacing w:after="480"/>
+      </w:pPr>
+      <w:r>
+        <w:rPr>
+          <w:b/>
+          <w:bCs/>
+          <w:i/>
+          <w:iCs/>
+        </w:rPr>
+        <w:t xml:space="preserve">Certified correct and in order:</w:t>
+      </w:r>
+    </w:p>
+    <w:p>
+      <w:pPr>
+        <w:keepNext/>
+        <w:spacing w:after="0"/>
+        <w:jc w:val="center"/>
+      </w:pPr>
+      <w:r>
+        <w:rPr>
+          <w:b/>
+          <w:bCs/>
+          <w:u w:val="single"/>
+        </w:rPr>
+        <w:t xml:space="preserve">FITZGERALD C. KINTANAR, Ed.D.</w:t>
+      </w:r>
+    </w:p>
+    <w:p>
+      <w:pPr>
+        <w:spacing w:after="240"/>
+        <w:jc w:val="center"/>
+      </w:pPr>
+      <w:r>
+        <w:t xml:space="preserve">Dean of Instruction</w:t>
+      </w:r>
+    </w:p>
+    <w:p>
+      <w:pPr>
+        <w:keepNext/>
+        <w:spacing w:after="480"/>
+      </w:pPr>
+      <w:r>
+        <w:rPr>
+          <w:b/>
+          <w:bCs/>
+          <w:i/>
+          <w:iCs/>
+        </w:rPr>
+        <w:t xml:space="preserve">Approved:</w:t>
+      </w:r>
+    </w:p>
+    <w:p>
+      <w:pPr>
+        <w:keepNext/>
+        <w:spacing w:after="0"/>
+        <w:jc w:val="center"/>
+      </w:pPr>
+      <w:r>
+        <w:rPr>
+          <w:b/>
+          <w:bCs/>
+          <w:u w:val="single"/>
+        </w:rPr>
+        <w:t xml:space="preserve">EINGILBERT C. BENOLIRAO, Dev.Ed.D.</w:t>
+      </w:r>
+    </w:p>
+    <w:p>
+      <w:pPr>
+        <w:spacing w:after="0"/>
+        <w:jc w:val="center"/>
+      </w:pPr>
+      <w:r>
+        <w:t xml:space="preserve">Campus Director</w:t>
       </w:r>
     </w:p>
     <w:p>
@@ -50,53 +1004,7 @@
         <w:spacing w:after="0"/>
       </w:pPr>
       <w:r>
-        <w:rPr>
-          <w:b/>
-        </w:rPr>
-        <w:t>FITZGERALD C. KINTANAR, Dev.Ed.D</w:t>
-      </w:r>
-    </w:p>
-    <w:p>
-      <w:pPr>
-        <w:spacing w:after="360"/>
-      </w:pPr>
-      <w:r>
-        <w:t>Dean of Instruction</w:t>
-      </w:r>
-    </w:p>
-    <w:p>
-      <w:pPr>
-        <w:spacing w:after="240"/>
-      </w:pPr>
-      <w:r>
-        <w:t>Sir:</w:t>
-      </w:r>
-    </w:p>
-    <w:p>
-      <w:pPr>
-        <w:spacing w:after="360"/>
-        <w:jc w:val="both"/>
-      </w:pPr>
-      <w:r>
-        <w:t xml:space="preserve">I am pleased to submit the list of candidates for Dean’s List for the Bachelor of Science in Information Technology for the Academic Year </w:t>
-      </w:r>
-      <w:r>
-        <w:rPr>
-          <w:b/>
-        </w:rPr>
-        <w:t>{schoolYear}</w:t>
-      </w:r>
-      <w:r>
-        <w:t xml:space="preserve"> (</w:t>
-      </w:r>
-      <w:r>
-        <w:rPr>
-          <w:b/>
-        </w:rPr>
-        <w:t>{semester}</w:t>
-      </w:r>
-      <w:r>
-        <w:t>). The said candidates have been carefully reviewed and verified in accordance with the university’s academic standards and guidelines.</w:t>
+        <w:br w:type="page"/>
       </w:r>
     </w:p>
     <w:p>
@@ -104,294 +1012,41 @@
         <w:spacing w:after="0"/>
       </w:pPr>
       <w:r>
-        <w:t>{#highestGwaGroups}</w:t>
+        <w:t xml:space="preserve">{#sections}</w:t>
       </w:r>
     </w:p>
     <w:p>
       <w:pPr>
         <w:keepNext/>
         <w:tabs>
-          <w:tab w:val="left" w:pos="2268"/>
-          <w:tab w:val="left" w:pos="6624"/>
+          <w:tab w:val="left" w:pos="6300"/>
         </w:tabs>
-        <w:spacing w:after="0"/>
+        <w:spacing w:before="360" w:after="0"/>
       </w:pPr>
       <w:r>
-        <w:t>Recognition</w:t>
-      </w:r>
-      <w:r>
-        <w:tab/>
-        <w:t xml:space="preserve">: </w:t>
+        <w:t xml:space="preserve">Course Year / Section: </w:t>
       </w:r>
       <w:r>
         <w:rPr>
           <w:b/>
+          <w:bCs/>
           <w:u w:val="single"/>
         </w:rPr>
-        <w:t>Highest GWA – All Year Levels</w:t>
-      </w:r>
-    </w:p>
-    <w:p>
-      <w:pPr>
-        <w:keepNext/>
-        <w:tabs>
-          <w:tab w:val="left" w:pos="2268"/>
-          <w:tab w:val="left" w:pos="6624"/>
-        </w:tabs>
-        <w:spacing w:after="0"/>
-      </w:pPr>
-    </w:p>
-    <w:tbl>
-      <w:tblPr>
-        <w:tblStyle w:val="TableGrid"/>
-        <w:tblW w:w="0" w:type="auto"/>
-        <w:jc w:val="center"/>
-        <w:tblLayout w:type="fixed"/>
-        <w:tblLook w:val="04A0" w:firstRow="1" w:lastRow="0" w:firstColumn="1" w:lastColumn="0" w:noHBand="0" w:noVBand="1"/>
-      </w:tblPr>
-      <w:tblGrid>
-        <w:gridCol w:w="864"/>
-        <w:gridCol w:w="4176"/>
-        <w:gridCol w:w="2880"/>
-        <w:gridCol w:w="1440"/>
-      </w:tblGrid>
-      <w:tr>
-        <w:trPr>
-          <w:cantSplit/>
-          <w:jc w:val="center"/>
-        </w:trPr>
-        <w:tc>
-          <w:tcPr>
-            <w:tcW w:w="864" w:type="dxa"/>
-            <w:shd w:val="clear" w:color="auto" w:fill="F0F0F0"/>
-          </w:tcPr>
-          <w:p>
-            <w:pPr>
-              <w:jc w:val="center"/>
-            </w:pPr>
-            <w:r>
-              <w:rPr>
-                <w:b/>
-              </w:rPr>
-              <w:t>No.</w:t>
-            </w:r>
-          </w:p>
-        </w:tc>
-        <w:tc>
-          <w:tcPr>
-            <w:tcW w:w="4176" w:type="dxa"/>
-            <w:shd w:val="clear" w:color="auto" w:fill="F0F0F0"/>
-          </w:tcPr>
-          <w:p>
-            <w:pPr>
-              <w:jc w:val="center"/>
-            </w:pPr>
-            <w:r>
-              <w:rPr>
-                <w:b/>
-              </w:rPr>
-              <w:t>Name</w:t>
-            </w:r>
-          </w:p>
-        </w:tc>
-        <w:tc>
-          <w:tcPr>
-            <w:tcW w:w="2880" w:type="dxa"/>
-            <w:shd w:val="clear" w:color="auto" w:fill="F0F0F0"/>
-          </w:tcPr>
-          <w:p>
-            <w:pPr>
-              <w:jc w:val="center"/>
-            </w:pPr>
-            <w:r>
-              <w:rPr>
-                <w:b/>
-              </w:rPr>
-              <w:t>Year Level / Section</w:t>
-            </w:r>
-          </w:p>
-        </w:tc>
-        <w:tc>
-          <w:tcPr>
-            <w:tcW w:w="1440" w:type="dxa"/>
-            <w:shd w:val="clear" w:color="auto" w:fill="F0F0F0"/>
-          </w:tcPr>
-          <w:p>
-            <w:pPr>
-              <w:jc w:val="center"/>
-            </w:pPr>
-            <w:r>
-              <w:rPr>
-                <w:b/>
-              </w:rPr>
-              <w:t>GWA</w:t>
-            </w:r>
-          </w:p>
-        </w:tc>
-      </w:tr>
-      <w:tr>
-        <w:trPr>
-          <w:cantSplit/>
-          <w:jc w:val="center"/>
-        </w:trPr>
-        <w:tc>
-          <w:tcPr>
-            <w:tcW w:w="864" w:type="dxa"/>
-          </w:tcPr>
-          <w:p>
-            <w:pPr>
-              <w:jc w:val="center"/>
-            </w:pPr>
-            <w:r>
-              <w:t>{#highestStudents}{no}</w:t>
-            </w:r>
-          </w:p>
-        </w:tc>
-        <w:tc>
-          <w:tcPr>
-            <w:tcW w:w="4176" w:type="dxa"/>
-          </w:tcPr>
-          <w:p>
-            <w:pPr>
-              <w:jc w:val="center"/>
-            </w:pPr>
-            <w:r>
-              <w:t>{name}</w:t>
-            </w:r>
-          </w:p>
-        </w:tc>
-        <w:tc>
-          <w:tcPr>
-            <w:tcW w:w="2880" w:type="dxa"/>
-          </w:tcPr>
-          <w:p>
-            <w:pPr>
-              <w:jc w:val="center"/>
-            </w:pPr>
-            <w:r>
-              <w:t>{yearSection}</w:t>
-            </w:r>
-          </w:p>
-        </w:tc>
-        <w:tc>
-          <w:tcPr>
-            <w:tcW w:w="1440" w:type="dxa"/>
-          </w:tcPr>
-          <w:p>
-            <w:pPr>
-              <w:jc w:val="center"/>
-            </w:pPr>
-            <w:r>
-              <w:t>{gwa}{/highestStudents}</w:t>
-            </w:r>
-          </w:p>
-        </w:tc>
-      </w:tr>
-    </w:tbl>
-    <w:p>
-      <w:pPr>
-        <w:spacing w:after="360"/>
-      </w:pPr>
-    </w:p>
-    <w:p>
-      <w:pPr>
-        <w:spacing w:after="120"/>
-      </w:pPr>
-      <w:r>
-        <w:t>{/highestGwaGroups}</w:t>
-      </w:r>
-    </w:p>
-    <w:p>
-      <w:pPr>
-        <w:spacing w:after="0"/>
-      </w:pPr>
-      <w:r>
-        <w:t>{#sections}</w:t>
-      </w:r>
-    </w:p>
-    <w:p>
-      <w:pPr>
-        <w:keepNext/>
-        <w:tabs>
-          <w:tab w:val="left" w:pos="2268"/>
-          <w:tab w:val="left" w:pos="6624"/>
-        </w:tabs>
-        <w:spacing w:after="0"/>
-      </w:pPr>
-      <w:r>
-        <w:t>Course Year / Section</w:t>
+        <w:t xml:space="preserve">{sectionName}</w:t>
       </w:r>
       <w:r>
         <w:tab/>
-        <w:t xml:space="preserve">: </w:t>
+      </w:r>
+      <w:r>
+        <w:t xml:space="preserve">No. of Students:</w:t>
       </w:r>
       <w:r>
         <w:rPr>
           <w:b/>
+          <w:bCs/>
           <w:u w:val="single"/>
         </w:rPr>
-        <w:t>{</w:t>
-      </w:r>
-      <w:proofErr w:type="spellStart"/>
-      <w:proofErr w:type="gramStart"/>
-      <w:r>
-        <w:rPr>
-          <w:b/>
-          <w:u w:val="single"/>
-        </w:rPr>
-        <w:t>sectionName</w:t>
-      </w:r>
-      <w:proofErr w:type="spellEnd"/>
-      <w:r>
-        <w:rPr>
-          <w:b/>
-          <w:u w:val="single"/>
-        </w:rPr>
-        <w:t>}</w:t>
-      </w:r>
-      <w:r>
-        <w:rPr>
-          <w:b/>
-        </w:rPr>
-        <w:t xml:space="preserve">   </w:t>
-      </w:r>
-      <w:proofErr w:type="gramEnd"/>
-      <w:r>
-        <w:rPr>
-          <w:b/>
-        </w:rPr>
-        <w:t xml:space="preserve">               </w:t>
-      </w:r>
-      <w:r>
-        <w:t xml:space="preserve">No. of </w:t>
-      </w:r>
-      <w:proofErr w:type="gramStart"/>
-      <w:r>
-        <w:t>Students:</w:t>
-      </w:r>
-      <w:r>
-        <w:rPr>
-          <w:b/>
-          <w:u w:val="single"/>
-        </w:rPr>
-        <w:t>{</w:t>
-      </w:r>
-      <w:proofErr w:type="spellStart"/>
-      <w:proofErr w:type="gramEnd"/>
-      <w:r>
-        <w:rPr>
-          <w:b/>
-          <w:u w:val="single"/>
-        </w:rPr>
-        <w:t>totalStudents</w:t>
-      </w:r>
-      <w:proofErr w:type="spellEnd"/>
-      <w:r>
-        <w:rPr>
-          <w:b/>
-          <w:u w:val="single"/>
-        </w:rPr>
-        <w:t>}</w:t>
+        <w:t xml:space="preserve">{totalStudents}</w:t>
       </w:r>
     </w:p>
     <w:p>
@@ -400,19 +1055,28 @@
         <w:tabs>
           <w:tab w:val="left" w:pos="2268"/>
         </w:tabs>
+        <w:spacing w:after="120"/>
       </w:pPr>
       <w:r>
-        <w:t>Adviser</w:t>
+        <w:t xml:space="preserve">Adviser</w:t>
       </w:r>
       <w:r>
         <w:tab/>
-        <w:t>: ____________________________</w:t>
+      </w:r>
+      <w:r>
+        <w:t xml:space="preserve">: </w:t>
+      </w:r>
+      <w:r>
+        <w:rPr>
+          <w:u w:val="single"/>
+        </w:rPr>
+        <w:t xml:space="preserve">{adviser}</w:t>
       </w:r>
     </w:p>
     <w:tbl>
       <w:tblPr>
         <w:tblStyle w:val="TableGrid"/>
-        <w:tblW w:w="0" w:type="auto"/>
+        <w:tblW w:w="9360" w:type="dxa"/>
         <w:jc w:val="center"/>
         <w:tblLayout w:type="fixed"/>
         <w:tblLook w:val="04A0" w:firstRow="1" w:lastRow="0" w:firstColumn="1" w:lastColumn="0" w:noHBand="0" w:noVBand="1"/>
@@ -424,22 +1088,26 @@
       </w:tblGrid>
       <w:tr>
         <w:trPr>
-          <w:jc w:val="center"/>
+          <w:cantSplit/>
+          <w:tblHeader/>
         </w:trPr>
         <w:tc>
           <w:tcPr>
             <w:tcW w:w="1008" w:type="dxa"/>
             <w:shd w:val="clear" w:color="auto" w:fill="F0F0F0"/>
+            <w:vAlign w:val="center"/>
           </w:tcPr>
           <w:p>
             <w:pPr>
+              <w:spacing w:after="0"/>
               <w:jc w:val="center"/>
             </w:pPr>
             <w:r>
               <w:rPr>
                 <w:b/>
+                <w:bCs/>
               </w:rPr>
-              <w:t>No.</w:t>
+              <w:t xml:space="preserve">No.</w:t>
             </w:r>
           </w:p>
         </w:tc>
@@ -447,16 +1115,19 @@
           <w:tcPr>
             <w:tcW w:w="6192" w:type="dxa"/>
             <w:shd w:val="clear" w:color="auto" w:fill="F0F0F0"/>
+            <w:vAlign w:val="center"/>
           </w:tcPr>
           <w:p>
             <w:pPr>
+              <w:spacing w:after="0"/>
               <w:jc w:val="center"/>
             </w:pPr>
             <w:r>
               <w:rPr>
                 <w:b/>
+                <w:bCs/>
               </w:rPr>
-              <w:t>Name</w:t>
+              <w:t xml:space="preserve">Name</w:t>
             </w:r>
           </w:p>
         </w:tc>
@@ -464,65 +1135,69 @@
           <w:tcPr>
             <w:tcW w:w="2160" w:type="dxa"/>
             <w:shd w:val="clear" w:color="auto" w:fill="F0F0F0"/>
+            <w:vAlign w:val="center"/>
           </w:tcPr>
           <w:p>
             <w:pPr>
+              <w:spacing w:after="0"/>
               <w:jc w:val="center"/>
             </w:pPr>
             <w:r>
               <w:rPr>
                 <w:b/>
+                <w:bCs/>
               </w:rPr>
-              <w:t>GWA</w:t>
+              <w:t xml:space="preserve">GWA</w:t>
             </w:r>
           </w:p>
         </w:tc>
       </w:tr>
       <w:tr>
         <w:trPr>
-          <w:jc w:val="center"/>
+          <w:cantSplit/>
         </w:trPr>
         <w:tc>
           <w:tcPr>
             <w:tcW w:w="1008" w:type="dxa"/>
+            <w:vAlign w:val="center"/>
           </w:tcPr>
           <w:p>
             <w:pPr>
+              <w:spacing w:after="0"/>
               <w:jc w:val="center"/>
             </w:pPr>
             <w:r>
-              <w:t>{#students}{no</w:t>
-            </w:r>
-            <w:r>
-              <w:lastRenderedPageBreak/>
-              <w:t>}</w:t>
+              <w:t xml:space="preserve">{#students}{no}</w:t>
             </w:r>
           </w:p>
         </w:tc>
         <w:tc>
           <w:tcPr>
             <w:tcW w:w="6192" w:type="dxa"/>
+            <w:vAlign w:val="center"/>
           </w:tcPr>
           <w:p>
             <w:pPr>
+              <w:spacing w:after="0"/>
               <w:jc w:val="center"/>
             </w:pPr>
             <w:r>
-              <w:lastRenderedPageBreak/>
-              <w:t>{name}</w:t>
+              <w:t xml:space="preserve">{name}</w:t>
             </w:r>
           </w:p>
         </w:tc>
         <w:tc>
           <w:tcPr>
             <w:tcW w:w="2160" w:type="dxa"/>
+            <w:vAlign w:val="center"/>
           </w:tcPr>
           <w:p>
             <w:pPr>
+              <w:spacing w:after="0"/>
               <w:jc w:val="center"/>
             </w:pPr>
             <w:r>
-              <w:t>{gwa}{/students}</w:t>
+              <w:t xml:space="preserve">{gwa}{/students}</w:t>
             </w:r>
           </w:p>
         </w:tc>
@@ -530,148 +1205,19 @@
     </w:tbl>
     <w:p>
       <w:pPr>
-        <w:spacing w:after="360"/>
-      </w:pPr>
-    </w:p>
-    <w:p>
-      <w:pPr>
-        <w:spacing w:after="120"/>
+        <w:spacing w:after="0"/>
       </w:pPr>
       <w:r>
-        <w:t>{/sections}</w:t>
+        <w:t xml:space="preserve">{/sections}</w:t>
       </w:r>
     </w:p>
     <w:p>
       <w:pPr>
-        <w:spacing w:after="240"/>
-      </w:pPr>
-      <w:r>
-        <w:t>Should you have any questions or require further information, please do not hesitate to contact me.</w:t>
-      </w:r>
-    </w:p>
-    <w:p>
-      <w:pPr>
-        <w:spacing w:after="360"/>
-      </w:pPr>
-      <w:r>
-        <w:t>Thank you for your attention to this matter.</w:t>
-      </w:r>
-    </w:p>
-    <w:p>
-      <w:pPr>
-        <w:spacing w:after="720"/>
-      </w:pPr>
-      <w:r>
-        <w:t>Sincerely,</w:t>
-      </w:r>
-    </w:p>
-    <w:p>
-      <w:pPr>
-        <w:spacing w:after="0"/>
+        <w:spacing w:before="0" w:after="0" w:line="20" w:lineRule="exact"/>
         <w:rPr>
-          <w:b/>
-          <w:bCs/>
+          <w:sz w:val="2"/>
         </w:rPr>
       </w:pPr>
-      <w:r>
-        <w:rPr>
-          <w:b/>
-          <w:bCs/>
-        </w:rPr>
-        <w:t xml:space="preserve">CHRISTINE JOY A TOMOL, </w:t>
-      </w:r>
-      <w:proofErr w:type="spellStart"/>
-      <w:proofErr w:type="gramStart"/>
-      <w:r>
-        <w:rPr>
-          <w:b/>
-          <w:bCs/>
-        </w:rPr>
-        <w:t>Ph.D</w:t>
-      </w:r>
-      <w:proofErr w:type="spellEnd"/>
-      <w:proofErr w:type="gramEnd"/>
-    </w:p>
-    <w:p>
-      <w:pPr>
-        <w:spacing w:after="480"/>
-      </w:pPr>
-      <w:r>
-        <w:t>Chairperson</w:t>
-      </w:r>
-      <w:r>
-        <w:t>, BSIT Department</w:t>
-      </w:r>
-    </w:p>
-    <w:p>
-      <w:pPr>
-        <w:spacing w:after="720"/>
-      </w:pPr>
-      <w:r>
-        <w:t>Noted by:</w:t>
-      </w:r>
-    </w:p>
-    <w:p>
-      <w:pPr>
-        <w:spacing w:after="0"/>
-        <w:rPr>
-          <w:b/>
-          <w:bCs/>
-        </w:rPr>
-      </w:pPr>
-      <w:r>
-        <w:rPr>
-          <w:b/>
-          <w:bCs/>
-        </w:rPr>
-        <w:t xml:space="preserve">FRITZ D. BACALSO, </w:t>
-      </w:r>
-      <w:proofErr w:type="spellStart"/>
-      <w:proofErr w:type="gramStart"/>
-      <w:r>
-        <w:rPr>
-          <w:b/>
-          <w:bCs/>
-        </w:rPr>
-        <w:t>Ph.D</w:t>
-      </w:r>
-      <w:proofErr w:type="spellEnd"/>
-      <w:proofErr w:type="gramEnd"/>
-    </w:p>
-    <w:p>
-      <w:pPr>
-        <w:spacing w:after="480"/>
-      </w:pPr>
-      <w:r>
-        <w:t>Dean, College of Technology &amp; Engineering</w:t>
-      </w:r>
-    </w:p>
-    <w:p>
-      <w:pPr>
-        <w:spacing w:after="720"/>
-      </w:pPr>
-      <w:r>
-        <w:t>Certified True and Correct:</w:t>
-      </w:r>
-    </w:p>
-    <w:p>
-      <w:pPr>
-        <w:spacing w:after="0"/>
-      </w:pPr>
-      <w:r>
-        <w:rPr>
-          <w:b/>
-        </w:rPr>
-        <w:t>Mrs. JOSEPHINE M. CABARDO</w:t>
-      </w:r>
-    </w:p>
-    <w:p>
-      <w:pPr>
-        <w:spacing w:after="0"/>
-      </w:pPr>
-      <w:r>
-        <w:t>Registrar</w:t>
-      </w:r>
     </w:p>
     <w:sectPr>
       <w:headerReference w:type="default" r:id="rId8"/>

</xml_diff>